<commit_message>
Update 3M bullet to reflect asset discovery work
</commit_message>
<xml_diff>
--- a/docs/Amin_Baabol_Resume.docx
+++ b/docs/Amin_Baabol_Resume.docx
@@ -50,7 +50,7 @@
         </w:rPr>
         <w:t xml:space="preserve">Woodbury, MN  |  </w:t>
       </w:r>
-      <w:hyperlink w:history="1" r:id="rIdoebwbzy1gntlvwuf_a-ky">
+      <w:hyperlink w:history="1" r:id="rIdxqymra8whly8nl4eqaduv">
         <w:r>
           <w:rPr>
             <w:rStyle w:val="Hyperlink"/>
@@ -70,7 +70,7 @@
         </w:rPr>
         <w:t xml:space="preserve">  |  </w:t>
       </w:r>
-      <w:hyperlink w:history="1" r:id="rId69s973cgdgyoc9dvf4m4j">
+      <w:hyperlink w:history="1" r:id="rIddsmf8i20u7dhc2w--yqcm">
         <w:r>
           <w:rPr>
             <w:rStyle w:val="Hyperlink"/>
@@ -901,7 +901,7 @@
           <w:sz w:val="19"/>
           <w:szCs w:val="19"/>
         </w:rPr>
-        <w:t xml:space="preserve">Partnered with data science and security teams to operationalize ML models for anomaly detection and predictive risk analysis</w:t>
+        <w:t xml:space="preserve">Built and managed data pipelines to discover and inventory assets across infrastructure domains and security tools, producing hygiene reports on endpoints, network devices, and identity systems</w:t>
       </w:r>
     </w:p>
     <w:p>

</xml_diff>

<commit_message>
Remove ML reference from 3M intern bullet
</commit_message>
<xml_diff>
--- a/docs/Amin_Baabol_Resume.docx
+++ b/docs/Amin_Baabol_Resume.docx
@@ -50,7 +50,7 @@
         </w:rPr>
         <w:t xml:space="preserve">Woodbury, MN  |  </w:t>
       </w:r>
-      <w:hyperlink w:history="1" r:id="rIdxqymra8whly8nl4eqaduv">
+      <w:hyperlink w:history="1" r:id="rId7huymds6htaulmuh1gcdr">
         <w:r>
           <w:rPr>
             <w:rStyle w:val="Hyperlink"/>
@@ -70,7 +70,7 @@
         </w:rPr>
         <w:t xml:space="preserve">  |  </w:t>
       </w:r>
-      <w:hyperlink w:history="1" r:id="rIddsmf8i20u7dhc2w--yqcm">
+      <w:hyperlink w:history="1" r:id="rIdr5jeczzvjr9uvky0mz270">
         <w:r>
           <w:rPr>
             <w:rStyle w:val="Hyperlink"/>
@@ -994,7 +994,7 @@
           <w:sz w:val="19"/>
           <w:szCs w:val="19"/>
         </w:rPr>
-        <w:t xml:space="preserve">Developed quantitative risk models and analytics dashboards supporting enterprise risk management, applying statistical analysis and ML to identify patterns in large-scale security datasets</w:t>
+        <w:t xml:space="preserve">Developed quantitative risk models and analytics dashboards supporting enterprise risk management, applying statistical analysis to identify patterns in large-scale security datasets</w:t>
       </w:r>
     </w:p>
     <w:p>

</xml_diff>